<commit_message>
MOO-257: rename the MOO-260 review to "red-team adversarial review"
Replaces every label of the MOO-260 pass as an "independent" review or
pass with "red-team adversarial review" across six documents (bill
draft, legal analysis memo, two-page brief, source appendix, red team
review, README). The rename also removes a contradiction: the package
disclosed that no independent reviewer was available while still
calling the review independent.

Retained: the independence caveats themselves ("no independent reviewer
was available", "an independent read of version 1.2 is advisable"), the
§ 30-19.1:7 quote on "local independent retirement systems", and
unrelated uses of "independent".

No statutory text, citation, figure, or recorded decision changed.
Brief page lengths are unchanged (one-pager 660 pt / 0.94 page,
two-pager 1340 pt / 1.90 pages, both FITS per pagecheck.py).

Co-Authored-By: Claude Opus 5 <noreply@anthropic.com>
</commit_message>
<xml_diff>
--- a/legislation/military-service-retirement-bridge/01-bill-draft.docx
+++ b/legislation/military-service-retirement-bridge/01-bill-draft.docx
@@ -725,7 +725,7 @@
           <w:strike w:val="0"/>
           <w:sz w:val="20"/>
         </w:rPr>
-        <w:t>(b) Independent review fixes applied.</w:t>
+        <w:t>(b) Red-team adversarial review fixes applied.</w:t>
       </w:r>
       <w:r>
         <w:rPr>
@@ -734,7 +734,7 @@
           <w:strike w:val="0"/>
           <w:sz w:val="20"/>
         </w:rPr>
-        <w:t xml:space="preserve"> The adversarial review in MOO-260 returned twelve findings and fourteen citation/drafting defects. Version 1.1 applies every fix that does not require a new policy decision: a new Title 2.2 conforming amendment (§ 2.2-3204), an "accumulated contributions" definitional amendment, an achievable-acceleration cap on the purchase amount, a pre-purchase written-estimate requirement, a cancellation-and-refund right, and corrections to the bare-"service" mismatch, the free-military-credit over-reach, and eleven pinpoint citations.</w:t>
+        <w:t xml:space="preserve"> The red-team adversarial review in MOO-260 returned twelve findings and fourteen citation/drafting defects. Version 1.1 applies every fix that does not require a new policy decision: a new Title 2.2 conforming amendment (§ 2.2-3204), an "accumulated contributions" definitional amendment, an achievable-acceleration cap on the purchase amount, a pre-purchase written-estimate requirement, a cancellation-and-refund right, and corrections to the bare-"service" mismatch, the free-military-credit over-reach, and eleven pinpoint citations.</w:t>
       </w:r>
     </w:p>
     <w:p>
@@ -3243,7 +3243,7 @@
           <w:i w:val="0"/>
           <w:strike w:val="0"/>
         </w:rPr>
-        <w:t>The three blockers from the independent review in MOO-260 (`06-red-team-review.docx`) are resolved.</w:t>
+        <w:t>The three blockers from the red-team adversarial review in MOO-260 (`06-red-team-review.docx`) are resolved.</w:t>
       </w:r>
       <w:r>
         <w:rPr>

</xml_diff>